<commit_message>
Correct CoDa classroom mapping and republish recalculated analysis
</commit_message>
<xml_diff>
--- a/submission/article_draft.docx
+++ b/submission/article_draft.docx
@@ -246,11 +246,11 @@
             <w:color w:val="8C1515"/>
             <w:u w:val="single"/>
           </w:rPr>
-          <w:t>82.5%</w:t>
+          <w:t>84.4%</w:t>
         </w:r>
       </w:hyperlink>
       <w:r>
-        <w:t xml:space="preserve"> of those possible transitions had an estimated route time of 10 minutes or less, and the median was 6.2 minutes. At the 90th percentile, however, </w:t>
+        <w:t xml:space="preserve"> of those possible transitions had an estimated route time of 10 minutes or less, and the median was 6.1 minutes. At the 90th percentile, however, </w:t>
       </w:r>
       <w:hyperlink r:id="rId13">
         <w:r>
@@ -258,14 +258,14 @@
             <w:color w:val="8C1515"/>
             <w:u w:val="single"/>
           </w:rPr>
-          <w:t>the route took 12.1 minutes, already beyond the next class's start time.</w:t>
+          <w:t>the route took 11.6 minutes, already beyond the next class's start time.</w:t>
         </w:r>
       </w:hyperlink>
       <w:r/>
     </w:p>
     <w:p>
       <w:r>
-        <w:t xml:space="preserve">That 17.5% is not a student lateness rate. The XML snapshot contained </w:t>
+        <w:t xml:space="preserve">That 15.6% is not a student lateness rate. The XML snapshot contained </w:t>
       </w:r>
       <w:hyperlink r:id="rId14">
         <w:r>
@@ -333,7 +333,7 @@
             <w:color w:val="8C1515"/>
             <w:u w:val="single"/>
           </w:rPr>
-          <w:t>83%</w:t>
+          <w:t>84%</w:t>
         </w:r>
       </w:hyperlink>
       <w:r>
@@ -350,7 +350,7 @@
             <w:color w:val="8C1515"/>
             <w:u w:val="single"/>
           </w:rPr>
-          <w:t>6.2 minutes</w:t>
+          <w:t>6.1 minutes</w:t>
         </w:r>
       </w:hyperlink>
       <w:r>
@@ -367,7 +367,7 @@
             <w:color w:val="8C1515"/>
             <w:u w:val="single"/>
           </w:rPr>
-          <w:t>12.1 minutes.</w:t>
+          <w:t>11.6 minutes.</w:t>
         </w:r>
       </w:hyperlink>
       <w:r>
@@ -388,7 +388,7 @@
           <w:b/>
           <w:sz w:val="19"/>
         </w:rPr>
-        <w:t>Buildings consume the margin. Reserve two minutes to exit and enter, and the fit rate falls from 82.5% to 69.0%.</w:t>
+        <w:t>Buildings consume the margin. Reserve two minutes to exit and enter, and the fit rate falls from 84.4% to 70.6%.</w:t>
       </w:r>
     </w:p>
     <w:p>
@@ -439,7 +439,7 @@
             <w:color w:val="8C1515"/>
             <w:u w:val="single"/>
           </w:rPr>
-          <w:t>56.2%</w:t>
+          <w:t>57.3%</w:t>
         </w:r>
       </w:hyperlink>
       <w:r>
@@ -451,7 +451,7 @@
             <w:color w:val="8C1515"/>
             <w:u w:val="single"/>
           </w:rPr>
-          <w:t>94.1%.</w:t>
+          <w:t>95.2%.</w:t>
         </w:r>
       </w:hyperlink>
       <w:r/>
@@ -471,7 +471,7 @@
             <w:color w:val="8C1515"/>
             <w:u w:val="single"/>
           </w:rPr>
-          <w:t>69.0%</w:t>
+          <w:t>70.6%</w:t>
         </w:r>
       </w:hyperlink>
       <w:r>
@@ -604,7 +604,7 @@
             <w:color w:val="8C1515"/>
             <w:u w:val="single"/>
           </w:rPr>
-          <w:t>At 1:20 p.m. to 1:30 p.m., there were 77,333 possible pairs and 81.9% fit at 3 mph. The 10:20 a.m. to 10:30 a.m. slot had 53,781 possible pairs and a higher modeled fit rate of 86.1%.</w:t>
+          <w:t>At 1:20 p.m. to 1:30 p.m., there were 77,333 possible pairs and 83.6% fit at 3 mph. The 10:20 a.m. to 10:30 a.m. slot had 53,781 possible pairs and a higher modeled fit rate of 88.1%.</w:t>
         </w:r>
       </w:hyperlink>
       <w:r/>
@@ -767,11 +767,11 @@
             <w:color w:val="8C1515"/>
             <w:u w:val="single"/>
           </w:rPr>
-          <w:t>62,525 possible pairs in which both meetings were coded LEC or DIS, 78.0% of LEC-to-LEC pairs fit within ten modeled minutes at 3 mph.</w:t>
+          <w:t>62,525 possible pairs in which both meetings were coded LEC or DIS, 83.1% of LEC-to-LEC pairs fit within ten modeled minutes at 3 mph.</w:t>
         </w:r>
       </w:hyperlink>
       <w:r>
-        <w:t xml:space="preserve"> The corresponding shares were 82.7% for LEC-to-DIS, 83.0% for DIS-to-LEC and 89.7% for DIS-to-DIS pairs. These percentages compare schedule-compatible meetings, not the schedules of students who move between lectures and sections.</w:t>
+        <w:t xml:space="preserve"> The corresponding shares were 85.6% for LEC-to-DIS, 86.6% for DIS-to-LEC and 89.7% for DIS-to-DIS pairs. These percentages compare schedule-compatible meetings, not the schedules of students who move between lectures and sections.</w:t>
       </w:r>
     </w:p>
     <w:p>
@@ -938,7 +938,7 @@
             <w:color w:val="8C1515"/>
             <w:u w:val="single"/>
           </w:rPr>
-          <w:t>7.3% of possible outgoing pairs from History meetings exceeded ten modeled minutes at 3 mph, compared with 21.6% from Computer Science and 35.7% from Music.</w:t>
+          <w:t>5.5% of possible outgoing pairs from History meetings exceeded ten modeled minutes at 3 mph, compared with 15.6% from Computer Science and 35.7% from Music.</w:t>
         </w:r>
       </w:hyperlink>
       <w:r>
@@ -1059,7 +1059,7 @@
             <w:color w:val="8C1515"/>
             <w:u w:val="single"/>
           </w:rPr>
-          <w:t>187 possible combinations; 42, or 22.5%, exceeded ten modeled minutes at 3 mph.</w:t>
+          <w:t>187 possible combinations; 15, or 8.0%, exceeded ten modeled minutes at 3 mph.</w:t>
         </w:r>
       </w:hyperlink>
       <w:r/>
@@ -1087,7 +1087,7 @@
       <w:r>
         <w:drawing>
           <wp:inline xmlns:a="http://schemas.openxmlformats.org/drawingml/2006/main" xmlns:pic="http://schemas.openxmlformats.org/drawingml/2006/picture">
-            <wp:extent cx="5760720" cy="2813062"/>
+            <wp:extent cx="5760720" cy="2841515"/>
             <wp:docPr id="5" name="Picture 5"/>
             <wp:cNvGraphicFramePr>
               <a:graphicFrameLocks noChangeAspect="1"/>
@@ -1108,7 +1108,7 @@
                   <pic:spPr>
                     <a:xfrm>
                       <a:off x="0" y="0"/>
-                      <a:ext cx="5760720" cy="2813062"/>
+                      <a:ext cx="5760720" cy="2841515"/>
                     </a:xfrm>
                     <a:prstGeom prst="rect"/>
                   </pic:spPr>
@@ -1226,7 +1226,7 @@
                 <w:sz w:val="17"/>
               </w:rPr>
               <w:br/>
-              <w:t>Ends Fri. at 11:20 a.m.</w:t>
+              <w:t>Ends Fri. at 9:20 a.m.</w:t>
             </w:r>
             <w:r>
               <w:rPr>
@@ -1235,7 +1235,7 @@
                 <w:sz w:val="17"/>
               </w:rPr>
               <w:br/>
-              <w:t>GEOPHYS 280</w:t>
+              <w:t>CHINLANG 22</w:t>
             </w:r>
             <w:r>
               <w:rPr>
@@ -1244,7 +1244,7 @@
                 <w:sz w:val="17"/>
               </w:rPr>
               <w:br/>
-              <w:t>Mitchell Earth Sciences</w:t>
+              <w:t>Building 260</w:t>
             </w:r>
             <w:r>
               <w:rPr>
@@ -1262,7 +1262,7 @@
                 <w:sz w:val="17"/>
               </w:rPr>
               <w:br/>
-              <w:t>Begins Fri. at 11:30 a.m.</w:t>
+              <w:t>Begins Fri. at 9:30 a.m.</w:t>
             </w:r>
             <w:r>
               <w:rPr>
@@ -1271,7 +1271,7 @@
                 <w:sz w:val="17"/>
               </w:rPr>
               <w:br/>
-              <w:t>TURKLANG 2A</w:t>
+              <w:t>MATH 21</w:t>
             </w:r>
             <w:r>
               <w:rPr>
@@ -1280,7 +1280,7 @@
                 <w:sz w:val="17"/>
               </w:rPr>
               <w:br/>
-              <w:t>Building 240</w:t>
+              <w:t>McCullough</w:t>
             </w:r>
             <w:r>
               <w:rPr>
@@ -1289,7 +1289,7 @@
                 <w:sz w:val="17"/>
               </w:rPr>
               <w:br/>
-              <w:t>497 m modeled route</w:t>
+              <w:t>490 m modeled route</w:t>
             </w:r>
             <w:r>
               <w:rPr>
@@ -1298,7 +1298,7 @@
                 <w:sz w:val="17"/>
               </w:rPr>
               <w:br/>
-              <w:t>6.2 min walk at 3 mph</w:t>
+              <w:t>6.1 min walk at 3 mph</w:t>
             </w:r>
             <w:r>
               <w:rPr>
@@ -1307,7 +1307,7 @@
                 <w:sz w:val="17"/>
               </w:rPr>
               <w:br/>
-              <w:t>+3.8 min modeled margin</w:t>
+              <w:t>+3.9 min modeled margin</w:t>
             </w:r>
             <w:r>
               <w:rPr>
@@ -1316,7 +1316,7 @@
                 <w:sz w:val="17"/>
               </w:rPr>
               <w:br/>
-              <w:t>2.9 min bike at 8 mph</w:t>
+              <w:t>4.8 min bike at 8 mph</w:t>
             </w:r>
           </w:p>
         </w:tc>
@@ -1929,7 +1929,7 @@
             <w:color w:val="8C1515"/>
             <w:u w:val="single"/>
           </w:rPr>
-          <w:t>15-minute route allowance raises the modeled fit rate from 82.5% to 97.3%.</w:t>
+          <w:t>15-minute route allowance raises the modeled fit rate from 84.4% to 97.5%.</w:t>
         </w:r>
       </w:hyperlink>
       <w:r>
@@ -1941,7 +1941,7 @@
             <w:color w:val="8C1515"/>
             <w:u w:val="single"/>
           </w:rPr>
-          <w:t>the comparison is 69.0% with a 10-minute period and 93.1% with a 15-minute period.</w:t>
+          <w:t>the comparison is 70.6% with a 10-minute period and 94.3% with a 15-minute period.</w:t>
         </w:r>
       </w:hyperlink>
       <w:r/>
@@ -1961,12 +1961,12 @@
     </w:p>
     <w:p>
       <w:r>
-        <w:t>82.5% route only at 3 mph</w:t>
+        <w:t>84.4% route only at 3 mph</w:t>
       </w:r>
     </w:p>
     <w:p>
       <w:r>
-        <w:t>69.0% with 2 min for buildings</w:t>
+        <w:t>70.6% with 2 min for buildings</w:t>
       </w:r>
     </w:p>
     <w:p>
@@ -1984,12 +1984,12 @@
     </w:p>
     <w:p>
       <w:r>
-        <w:t>97.3% route only at 3 mph</w:t>
+        <w:t>97.5% route only at 3 mph</w:t>
       </w:r>
     </w:p>
     <w:p>
       <w:r>
-        <w:t>93.1% with 2 min for buildings</w:t>
+        <w:t>94.3% with 2 min for buildings</w:t>
       </w:r>
     </w:p>
     <w:p>
@@ -2027,7 +2027,7 @@
             <w:color w:val="8C1515"/>
             <w:u w:val="single"/>
           </w:rPr>
-          <w:t>99.9% of possible pairs fit within ten route minutes, and the 90th percentile was 5.4 minutes. With two minutes reserved for bike handling and building transitions, 99.4% fit.</w:t>
+          <w:t>99.9% of possible pairs fit within ten route minutes, and the 90th percentile was 5.3 minutes. With two minutes reserved for bike handling and building transitions, 99.4% fit.</w:t>
         </w:r>
       </w:hyperlink>
       <w:r/>
@@ -2128,13 +2128,13 @@
       <w:r>
         <w:t xml:space="preserve">Most routes in the model were short. The story is the long tail, which traversed several different sections of campus. At 3 mph, the </w:t>
       </w:r>
-      <w:hyperlink r:id="rId42">
+      <w:hyperlink r:id="rId14">
         <w:r>
           <w:rPr>
             <w:color w:val="8C1515"/>
             <w:u w:val="single"/>
           </w:rPr>
-          <w:t>estimated route from Lathrop Library to Thornton Center took 12.9 minutes. The route from Building 200 to Cordura Hall took 14.1 minutes, and the route from Building 260 to the McMurtry Building took approximately 12 minutes.</w:t>
+          <w:t>estimated route from Lathrop Library to Thornton Center took 12.9 minutes. The route from the McMurtry Building to CEMEX Auditorium in Zambrano Hall took 13.8 minutes, and the route from Building 260 to the McMurtry Building took approximately 12 minutes.</w:t>
         </w:r>
       </w:hyperlink>
       <w:r/>
@@ -2165,7 +2165,7 @@
                     <pic:cNvPicPr/>
                   </pic:nvPicPr>
                   <pic:blipFill>
-                    <a:blip r:embed="rId43"/>
+                    <a:blip r:embed="rId42"/>
                     <a:stretch>
                       <a:fillRect/>
                     </a:stretch>
@@ -2193,7 +2193,7 @@
           <w:i/>
           <w:sz w:val="18"/>
         </w:rPr>
-        <w:t>The tail passes the bell. At 3 mph, 17.5% of routed possible pairings exceed ten modeled route minutes.</w:t>
+        <w:t>The tail passes the bell. At 3 mph, 15.6% of routed possible pairings exceed ten modeled route minutes.</w:t>
       </w:r>
     </w:p>
     <w:p>
@@ -2217,7 +2217,7 @@
                     <pic:cNvPicPr/>
                   </pic:nvPicPr>
                   <pic:blipFill>
-                    <a:blip r:embed="rId44"/>
+                    <a:blip r:embed="rId43"/>
                     <a:stretch>
                       <a:fillRect/>
                     </a:stretch>
@@ -2289,7 +2289,7 @@
     </w:p>
     <w:p>
       <w:r/>
-      <w:hyperlink r:id="rId45">
+      <w:hyperlink r:id="rId44">
         <w:r>
           <w:rPr>
             <w:color w:val="8C1515"/>
@@ -2335,7 +2335,7 @@
     </w:p>
     <w:p>
       <w:r/>
-      <w:hyperlink r:id="rId46">
+      <w:hyperlink r:id="rId45">
         <w:r>
           <w:rPr>
             <w:color w:val="8C1515"/>
@@ -2359,7 +2359,7 @@
       <w:r>
         <w:t xml:space="preserve"> </w:t>
       </w:r>
-      <w:hyperlink r:id="rId47">
+      <w:hyperlink r:id="rId46">
         <w:r>
           <w:rPr>
             <w:color w:val="8C1515"/>
@@ -2419,7 +2419,7 @@
       <w:r>
         <w:t xml:space="preserve"> Each pair is weighted equally because ExploreCourses does not reveal co-enrollment; this is a schedule model, not a count of students. The </w:t>
       </w:r>
-      <w:hyperlink r:id="rId47">
+      <w:hyperlink r:id="rId46">
         <w:r>
           <w:rPr>
             <w:color w:val="8C1515"/>
@@ -2585,7 +2585,7 @@
       <w:r>
         <w:t xml:space="preserve">The complete </w:t>
       </w:r>
-      <w:hyperlink r:id="rId47">
+      <w:hyperlink r:id="rId46">
         <w:r>
           <w:rPr>
             <w:color w:val="8C1515"/>
@@ -2597,7 +2597,7 @@
       <w:r>
         <w:t xml:space="preserve"> </w:t>
       </w:r>
-      <w:hyperlink r:id="rId48">
+      <w:hyperlink r:id="rId47">
         <w:r>
           <w:rPr>
             <w:color w:val="8C1515"/>

</xml_diff>